<commit_message>
fix(review): address CodeRabbit feedback on requirements, headings, win count, and plot robustness
</commit_message>
<xml_diff>
--- a/docs/BaoCao_Tuan5_6.docx
+++ b/docs/BaoCao_Tuan5_6.docx
@@ -410,6 +410,7 @@
     </w:p>
     <w:p>
       <w:pPr>
+        <w:pStyle w:val="Heading1"/>
         <w:keepNext/>
         <w:spacing w:before="320" w:after="120"/>
       </w:pPr>
@@ -537,6 +538,7 @@
     </w:p>
     <w:p>
       <w:pPr>
+        <w:pStyle w:val="Heading1"/>
         <w:keepNext/>
         <w:spacing w:before="320" w:after="120"/>
       </w:pPr>
@@ -566,6 +568,7 @@
     </w:p>
     <w:p>
       <w:pPr>
+        <w:pStyle w:val="Heading2"/>
         <w:keepNext/>
         <w:spacing w:before="240" w:after="80"/>
       </w:pPr>
@@ -647,6 +650,7 @@
     </w:p>
     <w:p>
       <w:pPr>
+        <w:pStyle w:val="Heading2"/>
         <w:keepNext/>
         <w:spacing w:before="240" w:after="80"/>
       </w:pPr>
@@ -676,6 +680,7 @@
     </w:p>
     <w:p>
       <w:pPr>
+        <w:pStyle w:val="Heading1"/>
         <w:keepNext/>
         <w:spacing w:before="320" w:after="120"/>
       </w:pPr>
@@ -691,6 +696,7 @@
     </w:p>
     <w:p>
       <w:pPr>
+        <w:pStyle w:val="Heading2"/>
         <w:keepNext/>
         <w:spacing w:before="240" w:after="80"/>
       </w:pPr>
@@ -808,6 +814,7 @@
     </w:p>
     <w:p>
       <w:pPr>
+        <w:pStyle w:val="Heading2"/>
         <w:keepNext/>
         <w:spacing w:before="240" w:after="80"/>
       </w:pPr>
@@ -881,6 +888,7 @@
     </w:p>
     <w:p>
       <w:pPr>
+        <w:pStyle w:val="Heading1"/>
         <w:keepNext/>
         <w:spacing w:before="320" w:after="120"/>
       </w:pPr>
@@ -910,6 +918,7 @@
     </w:p>
     <w:p>
       <w:pPr>
+        <w:pStyle w:val="Heading2"/>
         <w:keepNext/>
         <w:spacing w:before="240" w:after="80"/>
       </w:pPr>
@@ -975,6 +984,7 @@
     </w:p>
     <w:p>
       <w:pPr>
+        <w:pStyle w:val="Heading2"/>
         <w:keepNext/>
         <w:spacing w:before="240" w:after="80"/>
       </w:pPr>
@@ -1070,6 +1080,7 @@
     </w:p>
     <w:p>
       <w:pPr>
+        <w:pStyle w:val="Heading2"/>
         <w:keepNext/>
         <w:spacing w:before="240" w:after="80"/>
       </w:pPr>
@@ -1143,6 +1154,7 @@
     </w:p>
     <w:p>
       <w:pPr>
+        <w:pStyle w:val="Heading1"/>
         <w:keepNext/>
         <w:spacing w:before="320" w:after="120"/>
       </w:pPr>
@@ -1778,6 +1790,7 @@
     </w:p>
     <w:p>
       <w:pPr>
+        <w:pStyle w:val="Heading1"/>
         <w:keepNext/>
         <w:spacing w:before="320" w:after="120"/>
       </w:pPr>
@@ -1793,6 +1806,7 @@
     </w:p>
     <w:p>
       <w:pPr>
+        <w:pStyle w:val="Heading2"/>
         <w:keepNext/>
         <w:spacing w:before="240" w:after="80"/>
       </w:pPr>
@@ -5847,6 +5861,7 @@
     </w:tbl>
     <w:p>
       <w:pPr>
+        <w:pStyle w:val="Heading2"/>
         <w:keepNext/>
         <w:spacing w:before="240" w:after="80"/>
       </w:pPr>
@@ -6563,6 +6578,7 @@
     </w:tbl>
     <w:p>
       <w:pPr>
+        <w:pStyle w:val="Heading2"/>
         <w:keepNext/>
         <w:spacing w:before="240" w:after="80"/>
       </w:pPr>
@@ -6629,7 +6645,7 @@
           <w:color w:val="2D3748"/>
           <w:sz w:val="22"/>
         </w:rPr>
-        <w:t>Trả lời: IDBO thắng Mean ở 8 / 9 ô (chiếm 88.9%). Cụ thể: 1 ô hòa ở Rastrigin 2D (cả hai đều tìm thấy nghiệm tối ưu toàn cục 0.0), và IDBO chiến thắng áp đảo ở 8 ô còn lại (Rastrigin 10D, 30D; Ackley 2D, 10D, 30D; Griewank 2D, 10D, 30D). Đặc biệt trên Rastrigin 10D, DBO gốc thường xuyên bị kẹt ở các cực trị địa phương (Mean = 6.9647), trong khi IDBO thoát bẫy xuất sắc để kéo Mean xuống 1.8540.</w:t>
+        <w:t>Trả lời: IDBO thắng Mean ở 7 / 9 ô (chiếm 77.8%). Cụ thể: 2 ô hòa ở Rastrigin 2D và Ackley 2D (chênh lệch dưới 1%), và IDBO chiến thắng áp đảo ở 7 ô còn lại (Rastrigin 10D, 30D; Ackley 10D, 30D; Griewank 2D, 10D, 30D). Đặc biệt trên Rastrigin 10D, DBO gốc thường xuyên bị kẹt ở các cực trị địa phương (Mean = 6.9647), trong khi IDBO thoát bẫy xuất sắc để kéo Mean xuống 1.8540.</w:t>
       </w:r>
     </w:p>
     <w:p>
@@ -6718,6 +6734,7 @@
     </w:p>
     <w:p>
       <w:pPr>
+        <w:pStyle w:val="Heading2"/>
         <w:keepNext/>
         <w:spacing w:before="240" w:after="80"/>
       </w:pPr>
@@ -6960,6 +6977,7 @@
     </w:p>
     <w:p>
       <w:pPr>
+        <w:pStyle w:val="Heading1"/>
         <w:keepNext/>
         <w:spacing w:before="320" w:after="120"/>
       </w:pPr>
@@ -6975,6 +6993,7 @@
     </w:p>
     <w:p>
       <w:pPr>
+        <w:pStyle w:val="Heading2"/>
         <w:keepNext/>
         <w:spacing w:before="240" w:after="80"/>
       </w:pPr>
@@ -7004,6 +7023,7 @@
     </w:p>
     <w:p>
       <w:pPr>
+        <w:pStyle w:val="Heading2"/>
         <w:keepNext/>
         <w:spacing w:before="240" w:after="80"/>
       </w:pPr>
@@ -7099,6 +7119,7 @@
     </w:p>
     <w:p>
       <w:pPr>
+        <w:pStyle w:val="Heading1"/>
         <w:keepNext/>
         <w:spacing w:before="320" w:after="120"/>
       </w:pPr>
@@ -7114,6 +7135,7 @@
     </w:p>
     <w:p>
       <w:pPr>
+        <w:pStyle w:val="Heading2"/>
         <w:keepNext/>
         <w:spacing w:before="240" w:after="80"/>
       </w:pPr>
@@ -7199,6 +7221,7 @@
     </w:p>
     <w:p>
       <w:pPr>
+        <w:pStyle w:val="Heading2"/>
         <w:keepNext/>
         <w:spacing w:before="240" w:after="80"/>
       </w:pPr>
@@ -7280,6 +7303,7 @@
     </w:p>
     <w:p>
       <w:pPr>
+        <w:pStyle w:val="Heading1"/>
         <w:keepNext/>
         <w:spacing w:before="320" w:after="120"/>
       </w:pPr>
@@ -7295,6 +7319,7 @@
     </w:p>
     <w:p>
       <w:pPr>
+        <w:pStyle w:val="Heading2"/>
         <w:keepNext/>
         <w:spacing w:before="240" w:after="80"/>
       </w:pPr>
@@ -7352,6 +7377,7 @@
     </w:p>
     <w:p>
       <w:pPr>
+        <w:pStyle w:val="Heading2"/>
         <w:keepNext/>
         <w:spacing w:before="240" w:after="80"/>
       </w:pPr>
@@ -7426,6 +7452,7 @@
     </w:tbl>
     <w:p>
       <w:pPr>
+        <w:pStyle w:val="Heading2"/>
         <w:keepNext/>
         <w:spacing w:before="240" w:after="80"/>
       </w:pPr>

</xml_diff>